<commit_message>
Quality Assurance is updated by Nehir Adak
</commit_message>
<xml_diff>
--- a/Assignment3/Quality Assurance.docx
+++ b/Assignment3/Quality Assurance.docx
@@ -310,32 +310,8 @@
         </w:rPr>
         <w:t xml:space="preserve">  </w:t>
       </w:r>
-      <w:r>
-        <w:rPr>
-          <w:b/>
-          <w:bCs/>
-        </w:rPr>
-        <w:t xml:space="preserve">State Management Testing: </w:t>
-      </w:r>
-    </w:p>
-    <w:p>
-      <w:r>
-        <w:t xml:space="preserve">Tests will ensure that the </w:t>
-      </w:r>
-      <w:proofErr w:type="spellStart"/>
-      <w:proofErr w:type="gramStart"/>
-      <w:r>
-        <w:t>notifyListeners</w:t>
-      </w:r>
-      <w:proofErr w:type="spellEnd"/>
-      <w:r>
-        <w:t>(</w:t>
-      </w:r>
-      <w:proofErr w:type="gramEnd"/>
-      <w:r>
-        <w:t>) method is triggered correctly in the Provider, confirming the Observer Pattern successfully notifies the UI of data changes.</w:t>
-      </w:r>
-    </w:p>
+    </w:p>
+    <w:p/>
     <w:p>
       <w:pPr>
         <w:rPr>

</xml_diff>